<commit_message>
third semester first assignment of database
</commit_message>
<xml_diff>
--- a/Second_Semester/object_oriented_programming/c#_final/report of the final task.docx
+++ b/Second_Semester/object_oriented_programming/c#_final/report of the final task.docx
@@ -423,6 +423,106 @@
                     <a:xfrm>
                       <a:off x="0" y="0"/>
                       <a:ext cx="5731510" cy="1961515"/>
+                    </a:xfrm>
+                    <a:prstGeom prst="rect">
+                      <a:avLst/>
+                    </a:prstGeom>
+                  </pic:spPr>
+                </pic:pic>
+              </a:graphicData>
+            </a:graphic>
+          </wp:inline>
+        </w:drawing>
+      </w:r>
+    </w:p>
+    <w:p>
+      <w:pPr>
+        <w:pStyle w:val="ListParagraph"/>
+        <w:numPr>
+          <w:ilvl w:val="0"/>
+          <w:numId w:val="1"/>
+        </w:numPr>
+        <w:rPr>
+          <w:lang w:val="en-US"/>
+        </w:rPr>
+      </w:pPr>
+      <w:r>
+        <w:rPr>
+          <w:lang w:val="en-US"/>
+        </w:rPr>
+        <w:t xml:space="preserve">Here is the </w:t>
+      </w:r>
+      <w:proofErr w:type="spellStart"/>
+      <w:r>
+        <w:rPr>
+          <w:lang w:val="en-US"/>
+        </w:rPr>
+        <w:t>github</w:t>
+      </w:r>
+      <w:proofErr w:type="spellEnd"/>
+      <w:r>
+        <w:rPr>
+          <w:lang w:val="en-US"/>
+        </w:rPr>
+        <w:t xml:space="preserve"> repo link : </w:t>
+      </w:r>
+      <w:hyperlink r:id="rId10" w:history="1">
+        <w:r>
+          <w:rPr>
+            <w:rStyle w:val="Hyperlink"/>
+          </w:rPr>
+          <w:t>Vilnius_University_LT/Second_Semester/object_oriented_programming/c#_final at main · nayemhasan45/Vilnius_University_LT (github.com)</w:t>
+        </w:r>
+      </w:hyperlink>
+    </w:p>
+    <w:p>
+      <w:pPr>
+        <w:pStyle w:val="ListParagraph"/>
+        <w:numPr>
+          <w:ilvl w:val="0"/>
+          <w:numId w:val="1"/>
+        </w:numPr>
+        <w:rPr>
+          <w:lang w:val="en-US"/>
+        </w:rPr>
+      </w:pPr>
+      <w:r>
+        <w:rPr>
+          <w:noProof/>
+          <w:lang w:val="en-US"/>
+        </w:rPr>
+        <w:lastRenderedPageBreak/>
+        <w:drawing>
+          <wp:inline distT="0" distB="0" distL="0" distR="0" wp14:anchorId="44C75681" wp14:editId="6A07D5E1">
+            <wp:extent cx="5731510" cy="3223895"/>
+            <wp:effectExtent l="0" t="0" r="2540" b="0"/>
+            <wp:docPr id="467516272" name="Picture 1" descr="A screenshot of a computer&#10;&#10;Description automatically generated"/>
+            <wp:cNvGraphicFramePr>
+              <a:graphicFrameLocks xmlns:a="http://schemas.openxmlformats.org/drawingml/2006/main" noChangeAspect="1"/>
+            </wp:cNvGraphicFramePr>
+            <a:graphic xmlns:a="http://schemas.openxmlformats.org/drawingml/2006/main">
+              <a:graphicData uri="http://schemas.openxmlformats.org/drawingml/2006/picture">
+                <pic:pic xmlns:pic="http://schemas.openxmlformats.org/drawingml/2006/picture">
+                  <pic:nvPicPr>
+                    <pic:cNvPr id="467516272" name="Picture 1" descr="A screenshot of a computer&#10;&#10;Description automatically generated"/>
+                    <pic:cNvPicPr/>
+                  </pic:nvPicPr>
+                  <pic:blipFill>
+                    <a:blip r:embed="rId11" cstate="print">
+                      <a:extLst>
+                        <a:ext uri="{28A0092B-C50C-407E-A947-70E740481C1C}">
+                          <a14:useLocalDpi xmlns:a14="http://schemas.microsoft.com/office/drawing/2010/main" val="0"/>
+                        </a:ext>
+                      </a:extLst>
+                    </a:blip>
+                    <a:stretch>
+                      <a:fillRect/>
+                    </a:stretch>
+                  </pic:blipFill>
+                  <pic:spPr>
+                    <a:xfrm>
+                      <a:off x="0" y="0"/>
+                      <a:ext cx="5731510" cy="3223895"/>
                     </a:xfrm>
                     <a:prstGeom prst="rect">
                       <a:avLst/>
@@ -1489,6 +1589,18 @@
       <w:spacing w:val="5"/>
     </w:rPr>
   </w:style>
+  <w:style w:type="character" w:styleId="Hyperlink">
+    <w:name w:val="Hyperlink"/>
+    <w:basedOn w:val="DefaultParagraphFont"/>
+    <w:uiPriority w:val="99"/>
+    <w:semiHidden/>
+    <w:unhideWhenUsed/>
+    <w:rsid w:val="00426538"/>
+    <w:rPr>
+      <w:color w:val="0000FF"/>
+      <w:u w:val="single"/>
+    </w:rPr>
+  </w:style>
 </w:styles>
 </file>
 

</xml_diff>